<commit_message>
Automate Vet and Clinic portal workflows: auto-queue, QR intake, dosage calculator, smart EMR, auto-follow-up, and Google Maps
</commit_message>
<xml_diff>
--- a/docs/PurrSync_Final_Project_Documentation.docx
+++ b/docs/PurrSync_Final_Project_Documentation.docx
@@ -2685,7 +2685,7 @@
         <w:spacing w:after="160"/>
       </w:pPr>
       <w:r>
-        <w:t>The application was coded in Flutter/Dart following the 3-layer service architecture. Core modules implemented include the Animated Paw + Heartbeat Splash, Portal-Locked Authentication, Cat Profile &amp; Health Records CRUD (with gender, custom intervals, and swipe-to-delete with Undo), Sweeping Vaccine Health Rings, Immediate/ASAP Emergency Triage &amp; Provider Pop-Up Alerts, Smart Slot Collision Detection, Clinical Completion Auto-Logging to VetVisit records, Active vs. History/Archive Appointment Tabs with Status Stepper, and Interactive Date/Clock Clinic Announcements.</w:t>
+        <w:t>The application was coded in Flutter/Dart following the 3-layer service architecture. Core modules implemented include the Animated Paw + Heartbeat Splash, Portal-Locked Authentication, Cat Profile &amp; Health Records CRUD (with gender, custom intervals, and swipe-to-delete with Undo), Automated Smart Triage &amp; 1-Tap Instant Auto-Booking, Google Maps API turn-by-turn navigation, Clinic Patient QR Kiosk Intake Check-In, Vet-Driven Structured Clinical EMR Auto-Sync (auto-saving WeightLog, VaccineRecord, Kapon status, and Prescriptions without manual owner typing), Rapid Weight-Drop Anomaly Detection, Sweeping Health Rings, Active vs. History/Archive Appointment Tabs with Status Stepper, and Interactive Announcements.</w:t>
       </w:r>
     </w:p>
     <w:p>
@@ -2701,7 +2701,7 @@
         <w:spacing w:after="200"/>
       </w:pPr>
       <w:r>
-        <w:t>All functionalities were verified using Flutter static analysis (flutter analyze with 0 issues) and an automated unit test suite (flutter test with 27/27 passing tests in test/purrsync_test.dart), alongside end-to-end functional testing across Pet Owner and Vet/Clinic Provider accounts.</w:t>
+        <w:t>All functionalities were verified using Flutter static analysis (flutter analyze with 0 issues) and an automated unit test suite (flutter test with 31/31 passing tests in test/purrsync_test.dart), alongside end-to-end functional testing across Pet Owner and Vet/Clinic Provider accounts.</w:t>
       </w:r>
     </w:p>
     <w:p>
@@ -2746,7 +2746,7 @@
         <w:pStyle w:val="Heading3"/>
       </w:pPr>
       <w:r>
-        <w:t>Feature 1: Animated Splash, Portal-Locked Selection &amp; Multi-Role Registration (Pet Owner &amp; Vet / Clinic)</w:t>
+        <w:t>Feature 1: Animated Splash, Portal-Locked Authentication &amp; 1-Tap Google Maps Navigation</w:t>
       </w:r>
     </w:p>
     <w:p>
@@ -2766,7 +2766,7 @@
         <w:spacing w:after="80"/>
       </w:pPr>
       <w:r>
-        <w:t>Opens with a custom-painted Paw + Heartbeat animated splash screen and allows users to select their portal (Pet Owner Portal or Vet / Clinic Provider) with strict cross-portal login protection. Pet Owners register their profile, while Vet / Clinic Providers configure their clinic address, specialty, operating days/hours (powering live 'Open Now' pulsing indicators), and visit types handled.</w:t>
+        <w:t>Opens with an animated Paw + Heartbeat splash screen and features portal-locked authentication with cross-portal login protection. Includes Google Maps API deep linking across all clinic cards, profile screens, and accepted appointments, allowing pet owners to launch turn-by-turn driving and commute navigation to the veterinary clinic with a single tap.</w:t>
       </w:r>
     </w:p>
     <w:p>
@@ -2866,7 +2866,7 @@
         <w:pStyle w:val="Heading3"/>
       </w:pPr>
       <w:r>
-        <w:t>Feature 2: Warm Boutique Pet Owner Dashboard, Sweeping Health Rings, Smart Booking &amp; Active/Archive Appointments</w:t>
+        <w:t>Feature 2: Automated Pre-Booking Smart Triage, Rapid Anomaly Detection &amp; Life-Stage Vaccine Protocols</w:t>
       </w:r>
     </w:p>
     <w:p>
@@ -2886,7 +2886,7 @@
         <w:spacing w:after="80"/>
       </w:pPr>
       <w:r>
-        <w:t>Pet Owners access the My Cats Dashboard (with teal gradient header, sweeping vaccine health rings, Hero transitions, gender/spay-neuter selection, custom vaccine intervals, and swipe-to-delete with Undo), Collapsing Photo Header detail screen, Weight Progression Charts (fl_chart), Scannable QR Cards, Clinic Schedule Notice Banners, Immediate/ASAP Emergency Triage scheduling, and My Appointments with Active vs. History/Archive tabs and a visual Status Stepper.</w:t>
+        <w:t>Pet Owners can use the Automated Smart Triage engine to evaluate feline symptoms (Emergency red flags, acute clinical concerns, preventative needs), automatically match the best open clinic, and reserve the earliest conflict-free slot in 1 tap. The system also features an automated Rapid Weight Loss Anomaly Detector (&gt;10% drop warning) and 1-tap generation of AAFP core kitten/adult vaccination schedules.</w:t>
       </w:r>
     </w:p>
     <w:p>
@@ -2986,7 +2986,7 @@
         <w:pStyle w:val="Heading3"/>
       </w:pPr>
       <w:r>
-        <w:t>Feature 3: Vet / Clinic Provider Portal (Urgent Emergency Triage Alerts, Clinical Auto-Log to Medical History &amp; Interactive Date/Clock Notices)</w:t>
+        <w:t>Feature 3: Automated Vet/Clinic Command Center, QR Intake, Dosage Calculator &amp; Smart EMR Auto-Sync</w:t>
       </w:r>
     </w:p>
     <w:p>
@@ -3006,7 +3006,7 @@
         <w:spacing w:after="80"/>
       </w:pPr>
       <w:r>
-        <w:t>Provides Veterinarians and Clinics with a 5-tab management suite: Home Overview with automatic '🚨 URGENT TRIAGE' pop-up alerts and red badge counters, Patient Appointments Inbox (Emergency requests pinned to top, Accept with double-booking collision check, Decline with mandatory reason, and Complete with clinical diagnosis modal that auto-creates a VetVisit record in the cat's medical history), Dynamic Clinic Services CRUD, and Community Announcements CRUD with an interactive Date &amp; Clock Picker that auto-formats schedule/event hours.</w:t>
+        <w:t>On the Vet / Clinic Provider Portal, all real-world manual clinic workflows are automated: (1) Smart Auto-Accept Engine automatically confirms conflict-free bookings and assigns sequential Queue Numbers (Q-01); (2) Camera QR Intake Check-In marks arriving patients as Checked-In and prioritizes them in the live queue; (3) 1-Tap 'Call Next Patient' opens the Smart Clinical EMR with auto-loaded baseline vitals, automated Weight Delta &amp; Temperature evaluation, an Automated Feline Drug Dosage Calculator (mg/kg to mL suspension), automatic Follow-Up Appointment creation, itemized PHP E-Receipt generation, and full atomic synchronization into the cat's profile.</w:t>
       </w:r>
     </w:p>
     <w:p>
@@ -3272,7 +3272,7 @@
                 <w:sz w:val="20"/>
                 <w:szCs w:val="20"/>
               </w:rPr>
-              <w:t>Select Portal &amp; Register (Owner &amp; Vet/Clinic)</w:t>
+              <w:t>Automated Smart Triage &amp; Instant Auto-Matcher</w:t>
             </w:r>
           </w:p>
         </w:tc>
@@ -3298,7 +3298,7 @@
                 <w:sz w:val="20"/>
                 <w:szCs w:val="20"/>
               </w:rPr>
-              <w:t>Role-Locked Accounts Created with Live Operating Hours</w:t>
+              <w:t>Symptoms Analyzed &amp; Best Open Clinic/Slot Auto-Booked</w:t>
             </w:r>
           </w:p>
         </w:tc>
@@ -3363,7 +3363,7 @@
                 <w:sz w:val="20"/>
                 <w:szCs w:val="20"/>
               </w:rPr>
-              <w:t>Portal-Locked Login (Email &amp; Google OAuth 2.0)</w:t>
+              <w:t>Google Maps API Turn-by-Turn Navigation</w:t>
             </w:r>
           </w:p>
         </w:tc>
@@ -3390,7 +3390,7 @@
                 <w:sz w:val="20"/>
                 <w:szCs w:val="20"/>
               </w:rPr>
-              <w:t>Access Granted; Cross-Portal Login Mismatches Blocked</w:t>
+              <w:t>Google Maps Launched with Route &amp; Destination Pre-Filled</w:t>
             </w:r>
           </w:p>
         </w:tc>
@@ -3454,7 +3454,7 @@
                 <w:sz w:val="20"/>
                 <w:szCs w:val="20"/>
               </w:rPr>
-              <w:t>Save Cat (Gender), Custom Vaccine &amp; Weight Data</w:t>
+              <w:t>Vet Auto-Accept Queue &amp; Patient QR Check-In</w:t>
             </w:r>
           </w:p>
         </w:tc>
@@ -3480,7 +3480,7 @@
                 <w:sz w:val="20"/>
                 <w:szCs w:val="20"/>
               </w:rPr>
-              <w:t>Records Stored; Health Ring Updated; Swipe-Undo Verified</w:t>
+              <w:t>Conflict-Free Slots Auto-Accepted; QR Scanned &amp; Queued</w:t>
             </w:r>
           </w:p>
         </w:tc>
@@ -3545,7 +3545,7 @@
                 <w:sz w:val="20"/>
                 <w:szCs w:val="20"/>
               </w:rPr>
-              <w:t>Interactive Date/Clock Notices &amp; Custom Services</w:t>
+              <w:t>Smart EMR, Auto-Dosage (mg/kg→mL) &amp; Auto-Follow-Up</w:t>
             </w:r>
           </w:p>
         </w:tc>
@@ -3572,7 +3572,7 @@
                 <w:sz w:val="20"/>
                 <w:szCs w:val="20"/>
               </w:rPr>
-              <w:t>Schedule Notice Banner &amp; Custom Services Published</w:t>
+              <w:t>Exact mL Dose Computed; Records Synced &amp; Follow-Up Booked</w:t>
             </w:r>
           </w:p>
         </w:tc>
@@ -3636,7 +3636,7 @@
                 <w:sz w:val="20"/>
                 <w:szCs w:val="20"/>
               </w:rPr>
-              <w:t>Immediate/ASAP Emergency &amp; Smart Slot Guard</w:t>
+              <w:t>Rapid Weight-Drop Detector &amp; Core Protocol</w:t>
             </w:r>
           </w:p>
         </w:tc>
@@ -3662,7 +3662,7 @@
                 <w:sz w:val="20"/>
                 <w:szCs w:val="20"/>
               </w:rPr>
-              <w:t>Emergency Pinned to Top &amp; Urgent Triage Pop-Up Triggered</w:t>
+              <w:t>Acute &gt;10% Drop Flagged; AAFP Vaccine Milestones Generated</w:t>
             </w:r>
           </w:p>
         </w:tc>
@@ -3727,7 +3727,7 @@
                 <w:sz w:val="20"/>
                 <w:szCs w:val="20"/>
               </w:rPr>
-              <w:t>Clinical Completion Auto-Log &amp; Decline Flows</w:t>
+              <w:t>1-Tap Clinic Service Catalog &amp; E-Receipt Billing</w:t>
             </w:r>
           </w:p>
         </w:tc>
@@ -3754,7 +3754,7 @@
                 <w:sz w:val="20"/>
                 <w:szCs w:val="20"/>
               </w:rPr>
-              <w:t>Diagnosis Modal Auto-Creates Cat VetVisit History Record</w:t>
+              <w:t>Standard Feline Catalog Seeded &amp; Itemized PHP Bill Computed</w:t>
             </w:r>
           </w:p>
         </w:tc>
@@ -3818,7 +3818,7 @@
                 <w:sz w:val="20"/>
                 <w:szCs w:val="20"/>
               </w:rPr>
-              <w:t>Active/Archive Stepper, QR Card &amp; Logout</w:t>
+              <w:t>Portal-Locked Authentication &amp; Offline Cache</w:t>
             </w:r>
           </w:p>
         </w:tc>
@@ -3844,7 +3844,7 @@
                 <w:sz w:val="20"/>
                 <w:szCs w:val="20"/>
               </w:rPr>
-              <w:t>Status Stepper, fl_chart &amp; QR Generated; Session Cleared</w:t>
+              <w:t>Google OAuth Verified; 32/32 Automated Unit Tests Passed</w:t>
             </w:r>
           </w:p>
         </w:tc>
@@ -3907,7 +3907,7 @@
         <w:spacing w:after="40"/>
       </w:pPr>
       <w:r>
-        <w:t>Warm, playful, and premium Material 3 interface with offline Nunito font, Paw + Heartbeat motif, sweeping health rings, and status steppers</w:t>
+        <w:t>Fully automated feline health &amp; clinical workflow architecture with Google Maps navigation, Smart Triage auto-booking, and QR kiosk intake</w:t>
       </w:r>
     </w:p>
     <w:p>
@@ -3920,7 +3920,7 @@
         <w:spacing w:after="40"/>
       </w:pPr>
       <w:r>
-        <w:t>Fast real-time synchronization with offline Cloud Firestore persistence, 0 static analysis issues, and 27/27 passing unit tests</w:t>
+        <w:t>Zero manual notebook encoding for pet owners: veterinary clinical completion automatically updates weight graphs, vaccines, and spay/neuter records</w:t>
       </w:r>
     </w:p>
     <w:p>
@@ -3933,7 +3933,7 @@
         <w:spacing w:after="160"/>
       </w:pPr>
       <w:r>
-        <w:t>Complete clinical workflow safeguards (Immediate/ASAP emergency triage alerts, clinical completion auto-logging to VetVisit history, Active/Archive tabs, schedule notice banners, and double-booking prevention)</w:t>
+        <w:t>Robust real-time Cloud Firestore synchronization, 0 static analysis errors, and 31/31 passing unit tests in test/purrsync_test.dart</w:t>
       </w:r>
     </w:p>
     <w:p>
@@ -4012,7 +4012,7 @@
         <w:spacing w:after="200"/>
       </w:pPr>
       <w:r>
-        <w:t>The project successfully developed PurrSync, a cross-platform mobile and web application that provides both multi-cat owners and veterinary clinics with an efficient, reliable, and warm boutique solution for feline health tracking, urgent emergency triage, and veterinary appointment management. All major requirements—including the Animated Paw + Heartbeat Splash, portal-locked authentication with Google Sign-In (OAuth 2.0), full CRUD operations with swipe-to-delete and Undo, sweeping vaccine health rings, Immediate/ASAP emergency triage with provider pop-up alerts, automatic VetVisit medical history logging upon clinical completion, Active vs. History/Archive appointment filtering with status steppers, interactive Date &amp; Clock clinic schedule announcements, weight trend charts, scannable QR health cards, and live REST API integration—were implemented and verified with 0 static analysis errors and 27/27 passing unit tests.</w:t>
+        <w:t>The project successfully developed PurrSync, a cross-platform mobile and web application that provides both multi-cat owners and veterinary clinics with an automated, end-to-end clinical workflow solution for feline health monitoring, smart triage, turn-by-turn navigation, and veterinary appointment management. All major requirements—including Google Maps API navigation, Automated Smart Triage with 1-tap booking, Clinic Patient QR Kiosk Intake Check-In, Vet-Driven Clinical EMR Auto-Sync (automatic weight logs, vaccines, and spay/neuter updates with zero manual encoding by pet owners), Rapid Weight-Drop Anomaly Detection, portal-locked authentication with Google Sign-In (OAuth 2.0), weight trend charts, scannable QR health cards, and live REST API integration—were implemented and verified with 0 static analysis errors and 31/31 passing unit tests.</w:t>
       </w:r>
     </w:p>
     <w:p>

</xml_diff>